<commit_message>
Update FYP report template and meeting logs
</commit_message>
<xml_diff>
--- a/report/quarto/templates/fyp-cover-title-reference.docx
+++ b/report/quarto/templates/fyp-cover-title-reference.docx
@@ -1,6 +1,6 @@
 
 <file path=word/document.xml><?xml version="1.0" encoding="utf-8"?>
-<w:document xmlns:wpc="http://schemas.microsoft.com/office/word/2010/wordprocessingCanvas" xmlns:cx="http://schemas.microsoft.com/office/drawing/2014/chartex" xmlns:cx1="http://schemas.microsoft.com/office/drawing/2015/9/8/chartex" xmlns:cx2="http://schemas.microsoft.com/office/drawing/2015/10/21/chartex" xmlns:cx3="http://schemas.microsoft.com/office/drawing/2016/5/9/chartex" xmlns:cx4="http://schemas.microsoft.com/office/drawing/2016/5/10/chartex" xmlns:cx5="http://schemas.microsoft.com/office/drawing/2016/5/11/chartex" xmlns:cx6="http://schemas.microsoft.com/office/drawing/2016/5/12/chartex" xmlns:cx7="http://schemas.microsoft.com/office/drawing/2016/5/13/chartex" xmlns:cx8="http://schemas.microsoft.com/office/drawing/2016/5/14/chartex" xmlns:mc="http://schemas.openxmlformats.org/markup-compatibility/2006" xmlns:aink="http://schemas.microsoft.com/office/drawing/2016/ink" xmlns:am3d="http://schemas.microsoft.com/office/drawing/2017/model3d" xmlns:o="urn:schemas-microsoft-com:office:office" xmlns:oel="http://schemas.microsoft.com/office/2019/extlst" xmlns:r="http://schemas.openxmlformats.org/officeDocument/2006/relationships" xmlns:m="http://schemas.openxmlformats.org/officeDocument/2006/math" xmlns:v="urn:schemas-microsoft-com:vml" xmlns:wp14="http://schemas.microsoft.com/office/word/2010/wordprocessingDrawing" xmlns:wp="http://schemas.openxmlformats.org/drawingml/2006/wordprocessingDrawing" xmlns:w10="urn:schemas-microsoft-com:office:word" xmlns:w="http://schemas.openxmlformats.org/wordprocessingml/2006/main" xmlns:w14="http://schemas.microsoft.com/office/word/2010/wordml" xmlns:w15="http://schemas.microsoft.com/office/word/2012/wordml" xmlns:w16cex="http://schemas.microsoft.com/office/word/2018/wordml/cex" xmlns:w16cid="http://schemas.microsoft.com/office/word/2016/wordml/cid" xmlns:w16="http://schemas.microsoft.com/office/word/2018/wordml" xmlns:w16du="http://schemas.microsoft.com/office/word/2023/wordml/word16du" xmlns:w16sdtdh="http://schemas.microsoft.com/office/word/2020/wordml/sdtdatahash" xmlns:w16se="http://schemas.microsoft.com/office/word/2015/wordml/symex" xmlns:wpg="http://schemas.microsoft.com/office/word/2010/wordprocessingGroup" xmlns:wpi="http://schemas.microsoft.com/office/word/2010/wordprocessingInk" xmlns:wne="http://schemas.microsoft.com/office/word/2006/wordml" xmlns:wps="http://schemas.microsoft.com/office/word/2010/wordprocessingShape" mc:Ignorable="w14 w15 w16se w16cid w16 w16cex w16sdtdh w16du wp14">
+<w:document xmlns:wpc="http://schemas.microsoft.com/office/word/2010/wordprocessingCanvas" xmlns:mc="http://schemas.openxmlformats.org/markup-compatibility/2006" xmlns:o="urn:schemas-microsoft-com:office:office" xmlns:r="http://schemas.openxmlformats.org/officeDocument/2006/relationships" xmlns:m="http://schemas.openxmlformats.org/officeDocument/2006/math" xmlns:v="urn:schemas-microsoft-com:vml" xmlns:wp14="http://schemas.microsoft.com/office/word/2010/wordprocessingDrawing" xmlns:wp="http://schemas.openxmlformats.org/drawingml/2006/wordprocessingDrawing" xmlns:w10="urn:schemas-microsoft-com:office:word" xmlns:w="http://schemas.openxmlformats.org/wordprocessingml/2006/main" xmlns:w14="http://schemas.microsoft.com/office/word/2010/wordml" xmlns:w15="http://schemas.microsoft.com/office/word/2012/wordml" xmlns:wpg="http://schemas.microsoft.com/office/word/2010/wordprocessingGroup" xmlns:wpi="http://schemas.microsoft.com/office/word/2010/wordprocessingInk" xmlns:wne="http://schemas.microsoft.com/office/word/2006/wordml" xmlns:wps="http://schemas.microsoft.com/office/word/2010/wordprocessingShape" mc:Ignorable="w14 w15 wp14">
   <w:body>
     <w:p>
       <w:pPr>
@@ -20,7 +20,7 @@
           <w:noProof/>
           <w:sz w:val="36"/>
           <w:szCs w:val="36"/>
-          <w:lang w:val="en-GB"/>
+          <w:lang w:val="en-MY" w:eastAsia="en-MY"/>
         </w:rPr>
         <w:drawing>
           <wp:inline distT="0" distB="0" distL="0" distR="0" wp14:anchorId="4EA16CF0" wp14:editId="641E0A49">
@@ -126,9 +126,8 @@
           <w:rFonts w:ascii="Arial Narrow" w:hAnsi="Arial Narrow"/>
           <w:sz w:val="36"/>
           <w:szCs w:val="36"/>
-          <w:lang w:val="en-GB"/>
-        </w:rPr>
-        <w:t>&lt;APPROVED PROJECT ID&gt;</w:t>
+        </w:rPr>
+        <w:t>985</w:t>
       </w:r>
     </w:p>
     <w:p>
@@ -147,10 +146,115 @@
           <w:rFonts w:ascii="Arial Narrow" w:hAnsi="Arial Narrow"/>
           <w:sz w:val="36"/>
           <w:szCs w:val="36"/>
-          <w:lang w:val="en-GB"/>
-        </w:rPr>
-        <w:t>&lt;APPROVED PROJ</w:t>
+        </w:rPr>
+        <w:t>Machine Learning-Based System for Cardiopulmonary Sound Separation</w:t>
       </w:r>
+    </w:p>
+    <w:p>
+      <w:pPr>
+        <w:spacing w:after="0" w:line="240" w:lineRule="auto"/>
+        <w:jc w:val="center"/>
+        <w:rPr>
+          <w:sz w:val="36"/>
+          <w:szCs w:val="36"/>
+          <w:lang w:val="en-GB"/>
+        </w:rPr>
+      </w:pPr>
+    </w:p>
+    <w:p>
+      <w:pPr>
+        <w:spacing w:after="0" w:line="240" w:lineRule="auto"/>
+        <w:jc w:val="center"/>
+        <w:rPr>
+          <w:sz w:val="36"/>
+          <w:szCs w:val="36"/>
+          <w:lang w:val="en-GB"/>
+        </w:rPr>
+      </w:pPr>
+    </w:p>
+    <w:p>
+      <w:pPr>
+        <w:spacing w:after="0" w:line="240" w:lineRule="auto"/>
+        <w:jc w:val="center"/>
+        <w:rPr>
+          <w:rFonts w:ascii="Arial Narrow" w:hAnsi="Arial Narrow"/>
+          <w:sz w:val="36"/>
+          <w:szCs w:val="36"/>
+          <w:lang w:val="en-GB"/>
+        </w:rPr>
+      </w:pPr>
+    </w:p>
+    <w:p>
+      <w:pPr>
+        <w:spacing w:after="0" w:line="240" w:lineRule="auto"/>
+        <w:jc w:val="center"/>
+        <w:rPr>
+          <w:rFonts w:ascii="Arial Narrow" w:hAnsi="Arial Narrow"/>
+          <w:sz w:val="36"/>
+          <w:szCs w:val="36"/>
+          <w:lang w:val="en-GB"/>
+        </w:rPr>
+      </w:pPr>
+    </w:p>
+    <w:p>
+      <w:pPr>
+        <w:spacing w:after="0" w:line="240" w:lineRule="auto"/>
+        <w:jc w:val="center"/>
+        <w:rPr>
+          <w:rFonts w:ascii="Arial Narrow" w:hAnsi="Arial Narrow"/>
+          <w:sz w:val="36"/>
+          <w:szCs w:val="36"/>
+          <w:lang w:val="en-GB"/>
+        </w:rPr>
+      </w:pPr>
+    </w:p>
+    <w:p>
+      <w:pPr>
+        <w:spacing w:after="0" w:line="240" w:lineRule="auto"/>
+        <w:jc w:val="center"/>
+        <w:rPr>
+          <w:rFonts w:ascii="Arial Narrow" w:hAnsi="Arial Narrow"/>
+          <w:sz w:val="36"/>
+          <w:szCs w:val="36"/>
+          <w:lang w:val="en-GB"/>
+        </w:rPr>
+      </w:pPr>
+    </w:p>
+    <w:p>
+      <w:pPr>
+        <w:spacing w:after="0" w:line="240" w:lineRule="auto"/>
+        <w:jc w:val="center"/>
+        <w:rPr>
+          <w:rFonts w:ascii="Arial Narrow" w:hAnsi="Arial Narrow"/>
+          <w:sz w:val="36"/>
+          <w:szCs w:val="36"/>
+          <w:lang w:val="en-GB"/>
+        </w:rPr>
+      </w:pPr>
+    </w:p>
+    <w:p>
+      <w:pPr>
+        <w:spacing w:after="0" w:line="240" w:lineRule="auto"/>
+        <w:jc w:val="center"/>
+        <w:rPr>
+          <w:rFonts w:ascii="Arial Narrow" w:hAnsi="Arial Narrow"/>
+          <w:sz w:val="36"/>
+          <w:szCs w:val="36"/>
+          <w:lang w:val="en-GB"/>
+        </w:rPr>
+      </w:pPr>
+    </w:p>
+    <w:p>
+      <w:pPr>
+        <w:spacing w:after="0" w:line="240" w:lineRule="auto"/>
+        <w:jc w:val="center"/>
+        <w:rPr>
+          <w:rFonts w:ascii="Arial Narrow" w:hAnsi="Arial Narrow"/>
+          <w:sz w:val="36"/>
+          <w:szCs w:val="36"/>
+          <w:lang w:val="en-GB"/>
+        </w:rPr>
+      </w:pPr>
       <w:r>
         <w:rPr>
           <w:rFonts w:ascii="Arial Narrow" w:hAnsi="Arial Narrow"/>
@@ -158,8 +262,20 @@
           <w:szCs w:val="36"/>
           <w:lang w:val="en-GB"/>
         </w:rPr>
-        <w:t xml:space="preserve">ECT </w:t>
+        <w:t>1221303805</w:t>
       </w:r>
+    </w:p>
+    <w:p>
+      <w:pPr>
+        <w:spacing w:after="0" w:line="240" w:lineRule="auto"/>
+        <w:jc w:val="center"/>
+        <w:rPr>
+          <w:rFonts w:ascii="Arial Narrow" w:hAnsi="Arial Narrow"/>
+          <w:sz w:val="36"/>
+          <w:szCs w:val="36"/>
+          <w:lang w:val="en-GB"/>
+        </w:rPr>
+      </w:pPr>
       <w:r>
         <w:rPr>
           <w:rFonts w:ascii="Arial Narrow" w:hAnsi="Arial Narrow"/>
@@ -167,161 +283,7 @@
           <w:szCs w:val="36"/>
           <w:lang w:val="en-GB"/>
         </w:rPr>
-        <w:t>TITLE&gt;</w:t>
-      </w:r>
-    </w:p>
-    <w:p>
-      <w:pPr>
-        <w:spacing w:after="0" w:line="240" w:lineRule="auto"/>
-        <w:jc w:val="center"/>
-        <w:rPr>
-          <w:sz w:val="36"/>
-          <w:szCs w:val="36"/>
-          <w:lang w:val="en-GB"/>
-        </w:rPr>
-      </w:pPr>
-    </w:p>
-    <w:p>
-      <w:pPr>
-        <w:spacing w:after="0" w:line="240" w:lineRule="auto"/>
-        <w:jc w:val="center"/>
-        <w:rPr>
-          <w:sz w:val="36"/>
-          <w:szCs w:val="36"/>
-          <w:lang w:val="en-GB"/>
-        </w:rPr>
-      </w:pPr>
-    </w:p>
-    <w:p>
-      <w:pPr>
-        <w:spacing w:after="0" w:line="240" w:lineRule="auto"/>
-        <w:jc w:val="center"/>
-        <w:rPr>
-          <w:rFonts w:ascii="Arial Narrow" w:hAnsi="Arial Narrow"/>
-          <w:sz w:val="36"/>
-          <w:szCs w:val="36"/>
-          <w:lang w:val="en-GB"/>
-        </w:rPr>
-      </w:pPr>
-    </w:p>
-    <w:p>
-      <w:pPr>
-        <w:spacing w:after="0" w:line="240" w:lineRule="auto"/>
-        <w:jc w:val="center"/>
-        <w:rPr>
-          <w:rFonts w:ascii="Arial Narrow" w:hAnsi="Arial Narrow"/>
-          <w:sz w:val="36"/>
-          <w:szCs w:val="36"/>
-          <w:lang w:val="en-GB"/>
-        </w:rPr>
-      </w:pPr>
-    </w:p>
-    <w:p>
-      <w:pPr>
-        <w:spacing w:after="0" w:line="240" w:lineRule="auto"/>
-        <w:jc w:val="center"/>
-        <w:rPr>
-          <w:rFonts w:ascii="Arial Narrow" w:hAnsi="Arial Narrow"/>
-          <w:sz w:val="36"/>
-          <w:szCs w:val="36"/>
-          <w:lang w:val="en-GB"/>
-        </w:rPr>
-      </w:pPr>
-    </w:p>
-    <w:p>
-      <w:pPr>
-        <w:spacing w:after="0" w:line="240" w:lineRule="auto"/>
-        <w:jc w:val="center"/>
-        <w:rPr>
-          <w:rFonts w:ascii="Arial Narrow" w:hAnsi="Arial Narrow"/>
-          <w:sz w:val="36"/>
-          <w:szCs w:val="36"/>
-          <w:lang w:val="en-GB"/>
-        </w:rPr>
-      </w:pPr>
-    </w:p>
-    <w:p>
-      <w:pPr>
-        <w:spacing w:after="0" w:line="240" w:lineRule="auto"/>
-        <w:jc w:val="center"/>
-        <w:rPr>
-          <w:rFonts w:ascii="Arial Narrow" w:hAnsi="Arial Narrow"/>
-          <w:sz w:val="36"/>
-          <w:szCs w:val="36"/>
-          <w:lang w:val="en-GB"/>
-        </w:rPr>
-      </w:pPr>
-    </w:p>
-    <w:p>
-      <w:pPr>
-        <w:spacing w:after="0" w:line="240" w:lineRule="auto"/>
-        <w:jc w:val="center"/>
-        <w:rPr>
-          <w:rFonts w:ascii="Arial Narrow" w:hAnsi="Arial Narrow"/>
-          <w:sz w:val="36"/>
-          <w:szCs w:val="36"/>
-          <w:lang w:val="en-GB"/>
-        </w:rPr>
-      </w:pPr>
-    </w:p>
-    <w:p>
-      <w:pPr>
-        <w:spacing w:after="0" w:line="240" w:lineRule="auto"/>
-        <w:jc w:val="center"/>
-        <w:rPr>
-          <w:rFonts w:ascii="Arial Narrow" w:hAnsi="Arial Narrow"/>
-          <w:sz w:val="36"/>
-          <w:szCs w:val="36"/>
-          <w:lang w:val="en-GB"/>
-        </w:rPr>
-      </w:pPr>
-      <w:r>
-        <w:rPr>
-          <w:rFonts w:ascii="Arial Narrow" w:hAnsi="Arial Narrow"/>
-          <w:sz w:val="36"/>
-          <w:szCs w:val="36"/>
-          <w:lang w:val="en-GB"/>
-        </w:rPr>
-        <w:t>&lt;STUDENT’S ID</w:t>
-      </w:r>
-      <w:r>
-        <w:rPr>
-          <w:rFonts w:ascii="Arial Narrow" w:hAnsi="Arial Narrow"/>
-          <w:sz w:val="36"/>
-          <w:szCs w:val="36"/>
-          <w:lang w:val="en-GB"/>
-        </w:rPr>
-        <w:t>&gt;</w:t>
-      </w:r>
-    </w:p>
-    <w:p>
-      <w:pPr>
-        <w:spacing w:after="0" w:line="240" w:lineRule="auto"/>
-        <w:jc w:val="center"/>
-        <w:rPr>
-          <w:rFonts w:ascii="Arial Narrow" w:hAnsi="Arial Narrow"/>
-          <w:sz w:val="36"/>
-          <w:szCs w:val="36"/>
-          <w:lang w:val="en-GB"/>
-        </w:rPr>
-      </w:pPr>
-      <w:r>
-        <w:rPr>
-          <w:rFonts w:ascii="Arial Narrow" w:hAnsi="Arial Narrow"/>
-          <w:sz w:val="36"/>
-          <w:szCs w:val="36"/>
-          <w:lang w:val="en-GB"/>
-        </w:rPr>
-        <w:t>&lt;</w:t>
-      </w:r>
-      <w:r>
-        <w:rPr>
-          <w:rFonts w:ascii="Arial Narrow" w:hAnsi="Arial Narrow"/>
-          <w:sz w:val="36"/>
-          <w:szCs w:val="36"/>
-          <w:lang w:val="en-GB"/>
-        </w:rPr>
-        <w:t>NAME IN CAPITAL LETTERS&gt;</w:t>
+        <w:t>AL-SALOUL, ASHRAF ALI HUSSEIN</w:t>
       </w:r>
     </w:p>
     <w:p>
@@ -954,6 +916,8 @@
         </w:rPr>
         <w:t xml:space="preserve">in the </w:t>
       </w:r>
+      <w:bookmarkStart w:id="2" w:name="_GoBack"/>
+      <w:bookmarkEnd w:id="2"/>
     </w:p>
     <w:p>
       <w:pPr>
@@ -1165,7 +1129,7 @@
 </file>
 
 <file path=word/numbering.xml><?xml version="1.0" encoding="utf-8"?>
-<w:numbering xmlns:wpc="http://schemas.microsoft.com/office/word/2010/wordprocessingCanvas" xmlns:cx="http://schemas.microsoft.com/office/drawing/2014/chartex" xmlns:cx1="http://schemas.microsoft.com/office/drawing/2015/9/8/chartex" xmlns:cx2="http://schemas.microsoft.com/office/drawing/2015/10/21/chartex" xmlns:cx3="http://schemas.microsoft.com/office/drawing/2016/5/9/chartex" xmlns:cx4="http://schemas.microsoft.com/office/drawing/2016/5/10/chartex" xmlns:cx5="http://schemas.microsoft.com/office/drawing/2016/5/11/chartex" xmlns:cx6="http://schemas.microsoft.com/office/drawing/2016/5/12/chartex" xmlns:cx7="http://schemas.microsoft.com/office/drawing/2016/5/13/chartex" xmlns:cx8="http://schemas.microsoft.com/office/drawing/2016/5/14/chartex" xmlns:mc="http://schemas.openxmlformats.org/markup-compatibility/2006" xmlns:aink="http://schemas.microsoft.com/office/drawing/2016/ink" xmlns:am3d="http://schemas.microsoft.com/office/drawing/2017/model3d" xmlns:o="urn:schemas-microsoft-com:office:office" xmlns:oel="http://schemas.microsoft.com/office/2019/extlst" xmlns:r="http://schemas.openxmlformats.org/officeDocument/2006/relationships" xmlns:m="http://schemas.openxmlformats.org/officeDocument/2006/math" xmlns:v="urn:schemas-microsoft-com:vml" xmlns:wp14="http://schemas.microsoft.com/office/word/2010/wordprocessingDrawing" xmlns:wp="http://schemas.openxmlformats.org/drawingml/2006/wordprocessingDrawing" xmlns:w10="urn:schemas-microsoft-com:office:word" xmlns:w="http://schemas.openxmlformats.org/wordprocessingml/2006/main" xmlns:w14="http://schemas.microsoft.com/office/word/2010/wordml" xmlns:w15="http://schemas.microsoft.com/office/word/2012/wordml" xmlns:w16cex="http://schemas.microsoft.com/office/word/2018/wordml/cex" xmlns:w16cid="http://schemas.microsoft.com/office/word/2016/wordml/cid" xmlns:w16="http://schemas.microsoft.com/office/word/2018/wordml" xmlns:w16du="http://schemas.microsoft.com/office/word/2023/wordml/word16du" xmlns:w16sdtdh="http://schemas.microsoft.com/office/word/2020/wordml/sdtdatahash" xmlns:w16se="http://schemas.microsoft.com/office/word/2015/wordml/symex" xmlns:wpg="http://schemas.microsoft.com/office/word/2010/wordprocessingGroup" xmlns:wpi="http://schemas.microsoft.com/office/word/2010/wordprocessingInk" xmlns:wne="http://schemas.microsoft.com/office/word/2006/wordml" xmlns:wps="http://schemas.microsoft.com/office/word/2010/wordprocessingShape" mc:Ignorable="w14 w15 w16se w16cid w16 w16cex w16sdtdh w16du wp14">
+<w:numbering xmlns:wpc="http://schemas.microsoft.com/office/word/2010/wordprocessingCanvas" xmlns:mc="http://schemas.openxmlformats.org/markup-compatibility/2006" xmlns:o="urn:schemas-microsoft-com:office:office" xmlns:r="http://schemas.openxmlformats.org/officeDocument/2006/relationships" xmlns:m="http://schemas.openxmlformats.org/officeDocument/2006/math" xmlns:v="urn:schemas-microsoft-com:vml" xmlns:wp14="http://schemas.microsoft.com/office/word/2010/wordprocessingDrawing" xmlns:wp="http://schemas.openxmlformats.org/drawingml/2006/wordprocessingDrawing" xmlns:w10="urn:schemas-microsoft-com:office:word" xmlns:w="http://schemas.openxmlformats.org/wordprocessingml/2006/main" xmlns:w14="http://schemas.microsoft.com/office/word/2010/wordml" xmlns:w15="http://schemas.microsoft.com/office/word/2012/wordml" xmlns:wpg="http://schemas.microsoft.com/office/word/2010/wordprocessingGroup" xmlns:wpi="http://schemas.microsoft.com/office/word/2010/wordprocessingInk" xmlns:wne="http://schemas.microsoft.com/office/word/2006/wordml" xmlns:wps="http://schemas.microsoft.com/office/word/2010/wordprocessingShape" mc:Ignorable="w14 w15 wp14">
   <w:abstractNum w:abstractNumId="0" w15:restartNumberingAfterBreak="0">
     <w:nsid w:val="00000001"/>
     <w:multiLevelType w:val="hybridMultilevel"/>
@@ -1220,14 +1184,14 @@
       <w:lvlJc w:val="left"/>
     </w:lvl>
   </w:abstractNum>
-  <w:num w:numId="1" w16cid:durableId="1020206878">
+  <w:num w:numId="1">
     <w:abstractNumId w:val="0"/>
   </w:num>
 </w:numbering>
 </file>
 
 <file path=word/styles.xml><?xml version="1.0" encoding="utf-8"?>
-<w:styles xmlns:mc="http://schemas.openxmlformats.org/markup-compatibility/2006" xmlns:r="http://schemas.openxmlformats.org/officeDocument/2006/relationships" xmlns:w="http://schemas.openxmlformats.org/wordprocessingml/2006/main" xmlns:w14="http://schemas.microsoft.com/office/word/2010/wordml" xmlns:w15="http://schemas.microsoft.com/office/word/2012/wordml" xmlns:w16cex="http://schemas.microsoft.com/office/word/2018/wordml/cex" xmlns:w16cid="http://schemas.microsoft.com/office/word/2016/wordml/cid" xmlns:w16="http://schemas.microsoft.com/office/word/2018/wordml" xmlns:w16du="http://schemas.microsoft.com/office/word/2023/wordml/word16du" xmlns:w16sdtdh="http://schemas.microsoft.com/office/word/2020/wordml/sdtdatahash" xmlns:w16se="http://schemas.microsoft.com/office/word/2015/wordml/symex" mc:Ignorable="w14 w15 w16se w16cid w16 w16cex w16sdtdh w16du">
+<w:styles xmlns:mc="http://schemas.openxmlformats.org/markup-compatibility/2006" xmlns:r="http://schemas.openxmlformats.org/officeDocument/2006/relationships" xmlns:w="http://schemas.openxmlformats.org/wordprocessingml/2006/main" xmlns:w14="http://schemas.microsoft.com/office/word/2010/wordml" xmlns:w15="http://schemas.microsoft.com/office/word/2012/wordml" mc:Ignorable="w14 w15">
   <w:docDefaults>
     <w:rPrDefault>
       <w:rPr>
@@ -1245,7 +1209,7 @@
       </w:pPr>
     </w:pPrDefault>
   </w:docDefaults>
-  <w:latentStyles w:defLockedState="0" w:defUIPriority="99" w:defSemiHidden="0" w:defUnhideWhenUsed="0" w:defQFormat="0" w:count="376">
+  <w:latentStyles w:defLockedState="0" w:defUIPriority="99" w:defSemiHidden="0" w:defUnhideWhenUsed="0" w:defQFormat="0" w:count="371">
     <w:lsdException w:name="Normal" w:uiPriority="0" w:qFormat="1"/>
     <w:lsdException w:name="heading 1" w:uiPriority="9" w:qFormat="1"/>
     <w:lsdException w:name="heading 2" w:semiHidden="1" w:uiPriority="9" w:unhideWhenUsed="1" w:qFormat="1"/>
@@ -1617,11 +1581,6 @@
     <w:lsdException w:name="List Table 5 Dark Accent 6" w:uiPriority="50"/>
     <w:lsdException w:name="List Table 6 Colorful Accent 6" w:uiPriority="51"/>
     <w:lsdException w:name="List Table 7 Colorful Accent 6" w:uiPriority="52"/>
-    <w:lsdException w:name="Mention" w:semiHidden="1" w:unhideWhenUsed="1"/>
-    <w:lsdException w:name="Smart Hyperlink" w:semiHidden="1" w:unhideWhenUsed="1"/>
-    <w:lsdException w:name="Hashtag" w:semiHidden="1" w:unhideWhenUsed="1"/>
-    <w:lsdException w:name="Unresolved Mention" w:semiHidden="1" w:unhideWhenUsed="1"/>
-    <w:lsdException w:name="Smart Link" w:semiHidden="1" w:unhideWhenUsed="1"/>
   </w:latentStyles>
   <w:style w:type="paragraph" w:default="1" w:styleId="Normal">
     <w:name w:val="Normal"/>
@@ -1833,7 +1792,6 @@
   <w:style w:type="character" w:default="1" w:styleId="DefaultParagraphFont">
     <w:name w:val="Default Paragraph Font"/>
     <w:uiPriority w:val="1"/>
-    <w:semiHidden/>
     <w:unhideWhenUsed/>
   </w:style>
   <w:style w:type="table" w:default="1" w:styleId="TableNormal">
@@ -2500,7 +2458,7 @@
 </file>
 
 <file path=customXml/itemProps1.xml><?xml version="1.0" encoding="utf-8"?>
-<ds:datastoreItem xmlns:ds="http://schemas.openxmlformats.org/officeDocument/2006/customXml" ds:itemID="{14D391E5-C3A8-478B-A10C-63099430B0C6}">
+<ds:datastoreItem xmlns:ds="http://schemas.openxmlformats.org/officeDocument/2006/customXml" ds:itemID="{D64BBDB4-C3FB-4B8D-A94A-EAFFBED9E436}">
   <ds:schemaRefs>
     <ds:schemaRef ds:uri="http://schemas.openxmlformats.org/officeDocument/2006/bibliography"/>
   </ds:schemaRefs>

</xml_diff>